<commit_message>
docs: actualizar instrucciones y CI para la estructura final
</commit_message>
<xml_diff>
--- a/docs/ERS_EDUBIO360_EP2.docx
+++ b/docs/ERS_EDUBIO360_EP2.docx
@@ -2770,91 +2770,7 @@
         <w:pStyle w:val="FirstParagraph"/>
       </w:pPr>
       <w:r>
-        <w:t xml:space="preserve">El proyecto se ejecuta desde</w:t>
-      </w:r>
-      <w:r>
-        <w:t xml:space="preserve"> </w:t>
-      </w:r>
-      <w:r>
-        <w:rPr>
-          <w:rStyle w:val="VerbatimChar"/>
-          <w:rFonts w:ascii="Consolas" w:hAnsi="Consolas"/>
-          <w:color w:val="191919"/>
-          <w:sz w:val="18"/>
-        </w:rPr>
-        <w:t xml:space="preserve">ep2/</w:t>
-      </w:r>
-      <w:r>
-        <w:t xml:space="preserve"> </w:t>
-      </w:r>
-      <w:r>
-        <w:t xml:space="preserve">con</w:t>
-      </w:r>
-      <w:r>
-        <w:t xml:space="preserve"> </w:t>
-      </w:r>
-      <w:r>
-        <w:rPr>
-          <w:rStyle w:val="VerbatimChar"/>
-          <w:rFonts w:ascii="Consolas" w:hAnsi="Consolas"/>
-          <w:color w:val="191919"/>
-          <w:sz w:val="18"/>
-        </w:rPr>
-        <w:t xml:space="preserve">npm ci</w:t>
-      </w:r>
-      <w:r>
-        <w:t xml:space="preserve"> </w:t>
-      </w:r>
-      <w:r>
-        <w:t xml:space="preserve">y</w:t>
-      </w:r>
-      <w:r>
-        <w:t xml:space="preserve"> </w:t>
-      </w:r>
-      <w:r>
-        <w:rPr>
-          <w:rStyle w:val="VerbatimChar"/>
-          <w:rFonts w:ascii="Consolas" w:hAnsi="Consolas"/>
-          <w:color w:val="191919"/>
-          <w:sz w:val="18"/>
-        </w:rPr>
-        <w:t xml:space="preserve">npm run dev</w:t>
-      </w:r>
-      <w:r>
-        <w:t xml:space="preserve">. La validación técnica considera</w:t>
-      </w:r>
-      <w:r>
-        <w:t xml:space="preserve"> </w:t>
-      </w:r>
-      <w:r>
-        <w:rPr>
-          <w:rStyle w:val="VerbatimChar"/>
-          <w:rFonts w:ascii="Consolas" w:hAnsi="Consolas"/>
-          <w:color w:val="191919"/>
-          <w:sz w:val="18"/>
-        </w:rPr>
-        <w:t xml:space="preserve">npm run build</w:t>
-      </w:r>
-      <w:r>
-        <w:t xml:space="preserve">,</w:t>
-      </w:r>
-      <w:r>
-        <w:t xml:space="preserve"> </w:t>
-      </w:r>
-      <w:r>
-        <w:rPr>
-          <w:rStyle w:val="VerbatimChar"/>
-          <w:rFonts w:ascii="Consolas" w:hAnsi="Consolas"/>
-          <w:color w:val="191919"/>
-          <w:sz w:val="18"/>
-        </w:rPr>
-        <w:t xml:space="preserve">npm run test:coverage</w:t>
-      </w:r>
-      <w:r>
-        <w:t xml:space="preserve"> </w:t>
-      </w:r>
-      <w:r>
-        <w:t xml:space="preserve">y el flujo de GitHub Actions para construir y comprobar el contenedor Docker. El repositorio debe evidenciar cambios en ramas y aportes identificables del equipo. La defensa individual requiere explicar las decisiones y ejecutar las funciones y pruebas seleccionadas.</w:t>
+        <w:t>El proyecto se ejecuta desde la raíz del repositorio con npm ci y npm run dev. La validación técnica considera npm run build, npm run test:coverage y el flujo de GitHub Actions para construir y comprobar el contenedor Docker. El repositorio debe evidenciar cambios en ramas y aportes identificables del equipo. La defensa individual requiere explicar las decisiones y ejecutar las funciones y pruebas seleccionadas.</w:t>
       </w:r>
     </w:p>
     <w:bookmarkEnd w:id="28"/>

</xml_diff>